<commit_message>
TS 1.1- 1.2 Ghanam Jatai wip
</commit_message>
<xml_diff>
--- a/TS Jatai Ghanam Project/TS 1.3/TS 1.3 Ghanam Tamil Corrections.docx
+++ b/TS Jatai Ghanam Project/TS 1.3/TS 1.3 Ghanam Tamil Corrections.docx
@@ -183,136 +183,354 @@
           </w:tcPr>
           <w:p>
             <w:pPr>
-              <w:widowControl w:val="0"/>
               <w:autoSpaceDE w:val="0"/>
               <w:autoSpaceDN w:val="0"/>
               <w:adjustRightInd w:val="0"/>
-              <w:spacing w:before="0" w:line="240" w:lineRule="auto"/>
-              <w:rPr>
-                <w:rFonts w:ascii="BRH Devanagari Extra" w:hAnsi="BRH Devanagari Extra" w:cs="BRH Devanagari Extra"/>
-                <w:color w:val="000000"/>
+              <w:rPr>
+                <w:rFonts w:ascii="Latha" w:hAnsi="Latha" w:cs="Latha"/>
+                <w:szCs w:val="28"/>
+                <w:lang w:bidi="ta-IN"/>
+              </w:rPr>
+            </w:pPr>
+            <w:r>
+              <w:rPr>
+                <w:rFonts w:cs="Latha"/>
+                <w:b/>
+                <w:bCs/>
+                <w:szCs w:val="28"/>
+                <w:cs/>
+                <w:lang w:bidi="ta-IN"/>
+              </w:rPr>
+              <w:t>5</w:t>
+            </w:r>
+            <w:r>
+              <w:rPr>
+                <w:rFonts w:cs="Latha"/>
+                <w:b/>
+                <w:bCs/>
+                <w:szCs w:val="28"/>
+                <w:cs/>
+                <w:lang w:bidi="ta-IN"/>
+              </w:rPr>
+              <w:t>)</w:t>
+            </w:r>
+            <w:r>
+              <w:rPr>
+                <w:rFonts w:ascii="Latha" w:hAnsi="Latha" w:cs="Latha"/>
+                <w:szCs w:val="28"/>
+                <w:lang w:bidi="ta-IN"/>
+              </w:rPr>
+              <w:t xml:space="preserve">  </w:t>
+            </w:r>
+            <w:r>
+              <w:rPr>
+                <w:rFonts w:cs="Latha"/>
+                <w:b/>
+                <w:bCs/>
+                <w:szCs w:val="28"/>
+                <w:cs/>
+                <w:lang w:bidi="ta-IN"/>
+              </w:rPr>
+              <w:t>1.3.14.4</w:t>
+            </w:r>
+            <w:r>
+              <w:rPr>
+                <w:rFonts w:cs="Latha"/>
+                <w:b/>
+                <w:bCs/>
+                <w:szCs w:val="28"/>
+                <w:lang w:bidi="ta-IN"/>
+              </w:rPr>
+              <w:t>(</w:t>
+            </w:r>
+            <w:r>
+              <w:rPr>
+                <w:rFonts w:cs="Latha"/>
+                <w:b/>
+                <w:bCs/>
+                <w:szCs w:val="28"/>
+                <w:cs/>
+                <w:lang w:bidi="ta-IN"/>
+              </w:rPr>
+              <w:t>3</w:t>
+            </w:r>
+            <w:r>
+              <w:rPr>
+                <w:rFonts w:cs="Latha"/>
+                <w:b/>
+                <w:bCs/>
+                <w:szCs w:val="28"/>
+                <w:cs/>
+                <w:lang w:bidi="ta-IN"/>
+              </w:rPr>
+              <w:t>)</w:t>
+            </w:r>
+            <w:r>
+              <w:rPr>
+                <w:rFonts w:ascii="Latha" w:hAnsi="Latha" w:cs="Latha"/>
+                <w:szCs w:val="28"/>
+                <w:lang w:bidi="ta-IN"/>
+              </w:rPr>
+              <w:t xml:space="preserve">- </w:t>
+            </w:r>
+            <w:r>
+              <w:rPr>
+                <w:rFonts w:ascii="Latha" w:hAnsi="Latha" w:cs="Latha"/>
+                <w:szCs w:val="28"/>
+                <w:cs/>
+                <w:lang w:bidi="ta-IN"/>
+              </w:rPr>
+              <w:t>ர</w:t>
+            </w:r>
+            <w:r>
+              <w:rPr>
+                <w:rFonts w:ascii="BRH Tamil Tab Extra" w:hAnsi="BRH Tamil Tab Extra" w:cs="Latha"/>
+                <w:b/>
+                <w:bCs/>
+                <w:szCs w:val="28"/>
+                <w:lang w:bidi="ta-IN"/>
+              </w:rPr>
+              <w:t>…</w:t>
+            </w:r>
+            <w:r>
+              <w:rPr>
+                <w:rFonts w:ascii="Latha" w:hAnsi="Latha" w:cs="Latha"/>
+                <w:szCs w:val="28"/>
+                <w:cs/>
+                <w:lang w:bidi="ta-IN"/>
+              </w:rPr>
+              <w:t xml:space="preserve">யிம் </w:t>
+            </w:r>
+            <w:r>
+              <w:rPr>
+                <w:rFonts w:ascii="Latha" w:hAnsi="Latha" w:cs="Latha"/>
+                <w:szCs w:val="28"/>
+                <w:lang w:bidi="ta-IN"/>
+              </w:rPr>
+              <w:t>||</w:t>
+            </w:r>
+          </w:p>
+          <w:p>
+            <w:pPr>
+              <w:autoSpaceDE w:val="0"/>
+              <w:autoSpaceDN w:val="0"/>
+              <w:adjustRightInd w:val="0"/>
+              <w:rPr>
+                <w:rFonts w:cs="Latha"/>
+                <w:b/>
+                <w:bCs/>
                 <w:sz w:val="32"/>
-                <w:szCs w:val="40"/>
+                <w:szCs w:val="44"/>
+                <w:cs/>
+                <w:lang w:bidi="ta-IN"/>
               </w:rPr>
             </w:pPr>
             <w:r>
               <w:rPr>
-                <w:rFonts w:cs="BRH Devanagari Extra"/>
-                <w:color w:val="000000"/>
-                <w:szCs w:val="40"/>
+                <w:rFonts w:ascii="Latha" w:hAnsi="Latha" w:cs="Latha"/>
+                <w:szCs w:val="28"/>
+                <w:cs/>
+                <w:lang w:bidi="ta-IN"/>
+              </w:rPr>
+              <w:t>ர</w:t>
+            </w:r>
+            <w:r>
+              <w:rPr>
+                <w:rFonts w:ascii="BRH Tamil Tab Extra" w:hAnsi="BRH Tamil Tab Extra" w:cs="Latha"/>
+                <w:b/>
+                <w:bCs/>
+                <w:szCs w:val="28"/>
+                <w:lang w:bidi="ta-IN"/>
+              </w:rPr>
+              <w:t>…</w:t>
+            </w:r>
+            <w:r>
+              <w:rPr>
+                <w:rFonts w:ascii="Latha" w:hAnsi="Latha" w:cs="Latha"/>
+                <w:szCs w:val="28"/>
+                <w:cs/>
+                <w:lang w:bidi="ta-IN"/>
+              </w:rPr>
+              <w:t>யிமிதி</w:t>
+            </w:r>
+            <w:r>
+              <w:rPr>
+                <w:rFonts w:ascii="BRH Tamil Tab Extra" w:hAnsi="BRH Tamil Tab Extra" w:cs="Latha"/>
+                <w:b/>
+                <w:bCs/>
+                <w:szCs w:val="28"/>
+                <w:lang w:bidi="ta-IN"/>
+              </w:rPr>
+              <w:t>†</w:t>
+            </w:r>
+            <w:r>
+              <w:rPr>
+                <w:rFonts w:ascii="Latha" w:hAnsi="Latha" w:cs="Latha"/>
+                <w:szCs w:val="28"/>
+                <w:lang w:bidi="ta-IN"/>
+              </w:rPr>
+              <w:t xml:space="preserve"> </w:t>
+            </w:r>
+            <w:r>
+              <w:rPr>
+                <w:rFonts w:ascii="Latha" w:hAnsi="Latha" w:cs="Latha"/>
+                <w:szCs w:val="28"/>
+                <w:highlight w:val="yellow"/>
+                <w:cs/>
+                <w:lang w:bidi="ta-IN"/>
+              </w:rPr>
+              <w:t>ர</w:t>
+            </w:r>
+            <w:r>
+              <w:rPr>
+                <w:rFonts w:ascii="Latha" w:hAnsi="Latha" w:cs="Latha"/>
+                <w:szCs w:val="28"/>
+                <w:cs/>
+                <w:lang w:bidi="ta-IN"/>
+              </w:rPr>
+              <w:t xml:space="preserve">யிம் </w:t>
+            </w:r>
+            <w:r>
+              <w:rPr>
+                <w:rFonts w:ascii="Latha" w:hAnsi="Latha" w:cs="Latha"/>
+                <w:szCs w:val="28"/>
+                <w:lang w:bidi="ta-IN"/>
+              </w:rPr>
+              <w:t xml:space="preserve">| </w:t>
+            </w:r>
+          </w:p>
+        </w:tc>
+        <w:tc>
+          <w:tcPr>
+            <w:tcW w:w="7087" w:type="dxa"/>
+          </w:tcPr>
+          <w:p>
+            <w:pPr>
+              <w:autoSpaceDE w:val="0"/>
+              <w:autoSpaceDN w:val="0"/>
+              <w:adjustRightInd w:val="0"/>
+              <w:rPr>
+                <w:rFonts w:ascii="Latha" w:hAnsi="Latha" w:cs="Latha"/>
+                <w:szCs w:val="28"/>
+                <w:lang w:bidi="ta-IN"/>
+              </w:rPr>
+            </w:pPr>
+            <w:r>
+              <w:rPr>
+                <w:rFonts w:cs="Latha"/>
+                <w:b/>
+                <w:bCs/>
+                <w:szCs w:val="28"/>
+                <w:cs/>
+                <w:lang w:bidi="ta-IN"/>
               </w:rPr>
               <w:t>5</w:t>
             </w:r>
             <w:r>
               <w:rPr>
-                <w:rFonts w:ascii="BRH Devanagari Extra" w:hAnsi="BRH Devanagari Extra" w:cs="BRH Devanagari Extra"/>
-                <w:color w:val="000000"/>
-                <w:sz w:val="32"/>
-                <w:szCs w:val="40"/>
-              </w:rPr>
-              <w:t xml:space="preserve">)   </w:t>
-            </w:r>
-            <w:r>
-              <w:rPr>
-                <w:rFonts w:cs="BRH Devanagari Extra"/>
-                <w:color w:val="000000"/>
-                <w:szCs w:val="40"/>
-              </w:rPr>
-              <w:t>1</w:t>
-            </w:r>
-            <w:r>
-              <w:rPr>
-                <w:rFonts w:ascii="BRH Devanagari Extra" w:hAnsi="BRH Devanagari Extra" w:cs="BRH Devanagari Extra"/>
-                <w:color w:val="000000"/>
-                <w:sz w:val="32"/>
-                <w:szCs w:val="40"/>
-              </w:rPr>
-              <w:t>.</w:t>
-            </w:r>
-            <w:r>
-              <w:rPr>
-                <w:rFonts w:cs="BRH Devanagari Extra"/>
-                <w:color w:val="000000"/>
-                <w:szCs w:val="40"/>
+                <w:rFonts w:cs="Latha"/>
+                <w:b/>
+                <w:bCs/>
+                <w:szCs w:val="28"/>
+                <w:cs/>
+                <w:lang w:bidi="ta-IN"/>
+              </w:rPr>
+              <w:t>)</w:t>
+            </w:r>
+            <w:r>
+              <w:rPr>
+                <w:rFonts w:ascii="Latha" w:hAnsi="Latha" w:cs="Latha"/>
+                <w:szCs w:val="28"/>
+                <w:lang w:bidi="ta-IN"/>
+              </w:rPr>
+              <w:t xml:space="preserve">  </w:t>
+            </w:r>
+            <w:r>
+              <w:rPr>
+                <w:rFonts w:cs="Latha"/>
+                <w:b/>
+                <w:bCs/>
+                <w:szCs w:val="28"/>
+                <w:cs/>
+                <w:lang w:bidi="ta-IN"/>
+              </w:rPr>
+              <w:t>1.3.14.4</w:t>
+            </w:r>
+            <w:r>
+              <w:rPr>
+                <w:rFonts w:cs="Latha"/>
+                <w:b/>
+                <w:bCs/>
+                <w:szCs w:val="28"/>
+                <w:lang w:bidi="ta-IN"/>
+              </w:rPr>
+              <w:t>(</w:t>
+            </w:r>
+            <w:r>
+              <w:rPr>
+                <w:rFonts w:cs="Latha"/>
+                <w:b/>
+                <w:bCs/>
+                <w:szCs w:val="28"/>
+                <w:cs/>
+                <w:lang w:bidi="ta-IN"/>
               </w:rPr>
               <w:t>3</w:t>
             </w:r>
             <w:r>
               <w:rPr>
-                <w:rFonts w:ascii="BRH Devanagari Extra" w:hAnsi="BRH Devanagari Extra" w:cs="BRH Devanagari Extra"/>
-                <w:color w:val="000000"/>
-                <w:sz w:val="32"/>
-                <w:szCs w:val="40"/>
-              </w:rPr>
-              <w:t>.</w:t>
-            </w:r>
-            <w:r>
-              <w:rPr>
-                <w:rFonts w:cs="BRH Devanagari Extra"/>
-                <w:color w:val="000000"/>
-                <w:szCs w:val="40"/>
-              </w:rPr>
-              <w:t>14</w:t>
-            </w:r>
-            <w:r>
-              <w:rPr>
-                <w:rFonts w:ascii="BRH Devanagari Extra" w:hAnsi="BRH Devanagari Extra" w:cs="BRH Devanagari Extra"/>
-                <w:color w:val="000000"/>
-                <w:sz w:val="32"/>
-                <w:szCs w:val="40"/>
-              </w:rPr>
-              <w:t>.</w:t>
-            </w:r>
-            <w:r>
-              <w:rPr>
-                <w:rFonts w:cs="BRH Devanagari Extra"/>
-                <w:color w:val="000000"/>
-                <w:szCs w:val="40"/>
-              </w:rPr>
-              <w:t>4</w:t>
-            </w:r>
-            <w:r>
-              <w:rPr>
-                <w:rFonts w:ascii="BRH Devanagari Extra" w:hAnsi="BRH Devanagari Extra" w:cs="BRH Devanagari Extra"/>
-                <w:color w:val="000000"/>
-                <w:sz w:val="32"/>
-                <w:szCs w:val="40"/>
-              </w:rPr>
-              <w:t>(</w:t>
-            </w:r>
-            <w:r>
-              <w:rPr>
-                <w:rFonts w:cs="BRH Devanagari Extra"/>
-                <w:color w:val="000000"/>
-                <w:szCs w:val="40"/>
-              </w:rPr>
-              <w:t>3</w:t>
-            </w:r>
-            <w:r>
-              <w:rPr>
-                <w:rFonts w:ascii="BRH Devanagari Extra" w:hAnsi="BRH Devanagari Extra" w:cs="BRH Devanagari Extra"/>
-                <w:color w:val="000000"/>
-                <w:sz w:val="32"/>
-                <w:szCs w:val="40"/>
-              </w:rPr>
-              <w:t>)- U</w:t>
-            </w:r>
-            <w:r>
-              <w:rPr>
-                <w:rFonts w:ascii="BRH Malayalam Extra" w:hAnsi="BRH Malayalam Extra" w:cs="BRH Devanagari Extra"/>
-                <w:color w:val="000000"/>
-                <w:szCs w:val="40"/>
-              </w:rPr>
-              <w:t>–</w:t>
-            </w:r>
-            <w:r>
-              <w:rPr>
-                <w:rFonts w:ascii="BRH Devanagari Extra" w:hAnsi="BRH Devanagari Extra" w:cs="BRH Devanagari Extra"/>
-                <w:color w:val="000000"/>
-                <w:sz w:val="32"/>
-                <w:szCs w:val="40"/>
-              </w:rPr>
-              <w:t>ÌrÉqÉç ||</w:t>
+                <w:rFonts w:cs="Latha"/>
+                <w:b/>
+                <w:bCs/>
+                <w:szCs w:val="28"/>
+                <w:cs/>
+                <w:lang w:bidi="ta-IN"/>
+              </w:rPr>
+              <w:t>)</w:t>
+            </w:r>
+            <w:r>
+              <w:rPr>
+                <w:rFonts w:ascii="Latha" w:hAnsi="Latha" w:cs="Latha"/>
+                <w:szCs w:val="28"/>
+                <w:lang w:bidi="ta-IN"/>
+              </w:rPr>
+              <w:t xml:space="preserve">- </w:t>
+            </w:r>
+            <w:r>
+              <w:rPr>
+                <w:rFonts w:ascii="Latha" w:hAnsi="Latha" w:cs="Latha"/>
+                <w:szCs w:val="28"/>
+                <w:cs/>
+                <w:lang w:bidi="ta-IN"/>
+              </w:rPr>
+              <w:t>ர</w:t>
+            </w:r>
+            <w:r>
+              <w:rPr>
+                <w:rFonts w:ascii="BRH Tamil Tab Extra" w:hAnsi="BRH Tamil Tab Extra" w:cs="Latha"/>
+                <w:b/>
+                <w:bCs/>
+                <w:szCs w:val="28"/>
+                <w:lang w:bidi="ta-IN"/>
+              </w:rPr>
+              <w:t>…</w:t>
+            </w:r>
+            <w:r>
+              <w:rPr>
+                <w:rFonts w:ascii="Latha" w:hAnsi="Latha" w:cs="Latha"/>
+                <w:szCs w:val="28"/>
+                <w:cs/>
+                <w:lang w:bidi="ta-IN"/>
+              </w:rPr>
+              <w:t xml:space="preserve">யிம் </w:t>
+            </w:r>
+            <w:r>
+              <w:rPr>
+                <w:rFonts w:ascii="Latha" w:hAnsi="Latha" w:cs="Latha"/>
+                <w:szCs w:val="28"/>
+                <w:lang w:bidi="ta-IN"/>
+              </w:rPr>
+              <w:t>||</w:t>
             </w:r>
           </w:p>
           <w:p>
@@ -334,279 +552,87 @@
             </w:pPr>
             <w:r>
               <w:rPr>
-                <w:rFonts w:ascii="BRH Devanagari Extra" w:hAnsi="BRH Devanagari Extra" w:cs="BRH Devanagari Extra"/>
-                <w:color w:val="000000"/>
-                <w:sz w:val="32"/>
-                <w:szCs w:val="40"/>
-              </w:rPr>
-              <w:t>U</w:t>
-            </w:r>
-            <w:r>
-              <w:rPr>
-                <w:rFonts w:ascii="BRH Malayalam Extra" w:hAnsi="BRH Malayalam Extra" w:cs="BRH Devanagari Extra"/>
-                <w:color w:val="000000"/>
-                <w:szCs w:val="40"/>
-              </w:rPr>
-              <w:t>–</w:t>
-            </w:r>
-            <w:r>
-              <w:rPr>
-                <w:rFonts w:ascii="BRH Devanagari Extra" w:hAnsi="BRH Devanagari Extra" w:cs="BRH Devanagari Extra"/>
-                <w:color w:val="000000"/>
-                <w:sz w:val="32"/>
-                <w:szCs w:val="40"/>
-              </w:rPr>
-              <w:t xml:space="preserve">ÌrÉÍqÉÌiÉþ </w:t>
-            </w:r>
-            <w:r>
-              <w:rPr>
-                <w:rFonts w:ascii="BRH Devanagari Extra" w:hAnsi="BRH Devanagari Extra" w:cs="BRH Devanagari Extra"/>
-                <w:color w:val="000000"/>
-                <w:sz w:val="32"/>
-                <w:szCs w:val="40"/>
-                <w:highlight w:val="yellow"/>
-              </w:rPr>
-              <w:t>UÌ</w:t>
-            </w:r>
-            <w:r>
-              <w:rPr>
-                <w:rFonts w:ascii="BRH Devanagari Extra" w:hAnsi="BRH Devanagari Extra" w:cs="BRH Devanagari Extra"/>
-                <w:color w:val="000000"/>
-                <w:sz w:val="32"/>
-                <w:szCs w:val="40"/>
-              </w:rPr>
-              <w:t xml:space="preserve">rÉqÉç | </w:t>
-            </w:r>
-          </w:p>
-        </w:tc>
-        <w:tc>
-          <w:tcPr>
-            <w:tcW w:w="7087" w:type="dxa"/>
-          </w:tcPr>
-          <w:p>
-            <w:pPr>
-              <w:widowControl w:val="0"/>
-              <w:autoSpaceDE w:val="0"/>
-              <w:autoSpaceDN w:val="0"/>
-              <w:adjustRightInd w:val="0"/>
-              <w:spacing w:before="0" w:line="240" w:lineRule="auto"/>
-              <w:rPr>
-                <w:rFonts w:ascii="BRH Devanagari Extra" w:hAnsi="BRH Devanagari Extra" w:cs="BRH Devanagari Extra"/>
-                <w:color w:val="000000"/>
-                <w:sz w:val="32"/>
-                <w:szCs w:val="40"/>
-                <w:lang w:val="it-IT"/>
-              </w:rPr>
-            </w:pPr>
-            <w:r>
-              <w:rPr>
-                <w:rFonts w:cs="BRH Devanagari Extra"/>
-                <w:color w:val="000000"/>
-                <w:szCs w:val="40"/>
-                <w:lang w:val="it-IT"/>
-              </w:rPr>
-              <w:t>5</w:t>
-            </w:r>
-            <w:r>
-              <w:rPr>
-                <w:rFonts w:ascii="BRH Devanagari Extra" w:hAnsi="BRH Devanagari Extra" w:cs="BRH Devanagari Extra"/>
-                <w:color w:val="000000"/>
-                <w:sz w:val="32"/>
-                <w:szCs w:val="40"/>
-                <w:lang w:val="it-IT"/>
-              </w:rPr>
-              <w:t xml:space="preserve">)   </w:t>
-            </w:r>
-            <w:r>
-              <w:rPr>
-                <w:rFonts w:cs="BRH Devanagari Extra"/>
-                <w:color w:val="000000"/>
-                <w:szCs w:val="40"/>
-                <w:lang w:val="it-IT"/>
-              </w:rPr>
-              <w:t>1</w:t>
-            </w:r>
-            <w:r>
-              <w:rPr>
-                <w:rFonts w:ascii="BRH Devanagari Extra" w:hAnsi="BRH Devanagari Extra" w:cs="BRH Devanagari Extra"/>
-                <w:color w:val="000000"/>
-                <w:sz w:val="32"/>
-                <w:szCs w:val="40"/>
-                <w:lang w:val="it-IT"/>
-              </w:rPr>
-              <w:t>.</w:t>
-            </w:r>
-            <w:r>
-              <w:rPr>
-                <w:rFonts w:cs="BRH Devanagari Extra"/>
-                <w:color w:val="000000"/>
-                <w:szCs w:val="40"/>
-                <w:lang w:val="it-IT"/>
-              </w:rPr>
-              <w:t>3</w:t>
-            </w:r>
-            <w:r>
-              <w:rPr>
-                <w:rFonts w:ascii="BRH Devanagari Extra" w:hAnsi="BRH Devanagari Extra" w:cs="BRH Devanagari Extra"/>
-                <w:color w:val="000000"/>
-                <w:sz w:val="32"/>
-                <w:szCs w:val="40"/>
-                <w:lang w:val="it-IT"/>
-              </w:rPr>
-              <w:t>.</w:t>
-            </w:r>
-            <w:r>
-              <w:rPr>
-                <w:rFonts w:cs="BRH Devanagari Extra"/>
-                <w:color w:val="000000"/>
-                <w:szCs w:val="40"/>
-                <w:lang w:val="it-IT"/>
-              </w:rPr>
-              <w:t>14</w:t>
-            </w:r>
-            <w:r>
-              <w:rPr>
-                <w:rFonts w:ascii="BRH Devanagari Extra" w:hAnsi="BRH Devanagari Extra" w:cs="BRH Devanagari Extra"/>
-                <w:color w:val="000000"/>
-                <w:sz w:val="32"/>
-                <w:szCs w:val="40"/>
-                <w:lang w:val="it-IT"/>
-              </w:rPr>
-              <w:t>.</w:t>
-            </w:r>
-            <w:r>
-              <w:rPr>
-                <w:rFonts w:cs="BRH Devanagari Extra"/>
-                <w:color w:val="000000"/>
-                <w:szCs w:val="40"/>
-                <w:lang w:val="it-IT"/>
-              </w:rPr>
-              <w:t>4</w:t>
-            </w:r>
-            <w:r>
-              <w:rPr>
-                <w:rFonts w:ascii="BRH Devanagari Extra" w:hAnsi="BRH Devanagari Extra" w:cs="BRH Devanagari Extra"/>
-                <w:color w:val="000000"/>
-                <w:sz w:val="32"/>
-                <w:szCs w:val="40"/>
-                <w:lang w:val="it-IT"/>
-              </w:rPr>
-              <w:t>(</w:t>
-            </w:r>
-            <w:r>
-              <w:rPr>
-                <w:rFonts w:cs="BRH Devanagari Extra"/>
-                <w:color w:val="000000"/>
-                <w:szCs w:val="40"/>
-                <w:lang w:val="it-IT"/>
-              </w:rPr>
-              <w:t>3</w:t>
-            </w:r>
-            <w:r>
-              <w:rPr>
-                <w:rFonts w:ascii="BRH Devanagari Extra" w:hAnsi="BRH Devanagari Extra" w:cs="BRH Devanagari Extra"/>
-                <w:color w:val="000000"/>
-                <w:sz w:val="32"/>
-                <w:szCs w:val="40"/>
-                <w:lang w:val="it-IT"/>
-              </w:rPr>
-              <w:t>)- U</w:t>
-            </w:r>
-            <w:r>
-              <w:rPr>
-                <w:rFonts w:ascii="BRH Malayalam Extra" w:hAnsi="BRH Malayalam Extra" w:cs="BRH Devanagari Extra"/>
-                <w:color w:val="000000"/>
-                <w:szCs w:val="40"/>
-                <w:lang w:val="it-IT"/>
-              </w:rPr>
-              <w:t>–</w:t>
-            </w:r>
-            <w:r>
-              <w:rPr>
-                <w:rFonts w:ascii="BRH Devanagari Extra" w:hAnsi="BRH Devanagari Extra" w:cs="BRH Devanagari Extra"/>
-                <w:color w:val="000000"/>
-                <w:sz w:val="32"/>
-                <w:szCs w:val="40"/>
-                <w:lang w:val="it-IT"/>
-              </w:rPr>
-              <w:t>ÌrÉqÉç ||</w:t>
-            </w:r>
-          </w:p>
-          <w:p>
-            <w:pPr>
-              <w:widowControl w:val="0"/>
-              <w:autoSpaceDE w:val="0"/>
-              <w:autoSpaceDN w:val="0"/>
-              <w:adjustRightInd w:val="0"/>
-              <w:spacing w:before="0" w:line="240" w:lineRule="auto"/>
-              <w:rPr>
-                <w:rFonts w:cs="Latha"/>
-                <w:b/>
-                <w:bCs/>
-                <w:sz w:val="32"/>
-                <w:szCs w:val="44"/>
-                <w:cs/>
-                <w:lang w:bidi="ta-IN"/>
-              </w:rPr>
-            </w:pPr>
-            <w:r>
-              <w:rPr>
-                <w:rFonts w:ascii="BRH Devanagari Extra" w:hAnsi="BRH Devanagari Extra" w:cs="BRH Devanagari Extra"/>
-                <w:color w:val="000000"/>
-                <w:sz w:val="32"/>
-                <w:szCs w:val="40"/>
-                <w:lang w:val="it-IT"/>
-              </w:rPr>
-              <w:t>U</w:t>
-            </w:r>
-            <w:r>
-              <w:rPr>
-                <w:rFonts w:ascii="BRH Malayalam Extra" w:hAnsi="BRH Malayalam Extra" w:cs="BRH Devanagari Extra"/>
-                <w:color w:val="000000"/>
-                <w:szCs w:val="40"/>
-                <w:lang w:val="it-IT"/>
-              </w:rPr>
-              <w:t>–</w:t>
-            </w:r>
-            <w:r>
-              <w:rPr>
-                <w:rFonts w:ascii="BRH Devanagari Extra" w:hAnsi="BRH Devanagari Extra" w:cs="BRH Devanagari Extra"/>
-                <w:color w:val="000000"/>
-                <w:sz w:val="32"/>
-                <w:szCs w:val="40"/>
-                <w:lang w:val="it-IT"/>
-              </w:rPr>
-              <w:t xml:space="preserve">ÌrÉÍqÉÌiÉþ </w:t>
-            </w:r>
-            <w:r>
-              <w:rPr>
-                <w:rFonts w:ascii="BRH Devanagari Extra" w:hAnsi="BRH Devanagari Extra" w:cs="BRH Devanagari Extra"/>
-                <w:color w:val="000000"/>
-                <w:sz w:val="32"/>
-                <w:szCs w:val="40"/>
+                <w:rFonts w:ascii="Latha" w:hAnsi="Latha" w:cs="Latha"/>
+                <w:szCs w:val="28"/>
+                <w:cs/>
+                <w:lang w:bidi="ta-IN"/>
+              </w:rPr>
+              <w:t>ர</w:t>
+            </w:r>
+            <w:r>
+              <w:rPr>
+                <w:rFonts w:ascii="BRH Tamil Tab Extra" w:hAnsi="BRH Tamil Tab Extra" w:cs="Latha"/>
+                <w:b/>
+                <w:bCs/>
+                <w:szCs w:val="28"/>
+                <w:lang w:bidi="ta-IN"/>
+              </w:rPr>
+              <w:t>…</w:t>
+            </w:r>
+            <w:r>
+              <w:rPr>
+                <w:rFonts w:ascii="Latha" w:hAnsi="Latha" w:cs="Latha"/>
+                <w:szCs w:val="28"/>
+                <w:cs/>
+                <w:lang w:bidi="ta-IN"/>
+              </w:rPr>
+              <w:t>யிமிதி</w:t>
+            </w:r>
+            <w:r>
+              <w:rPr>
+                <w:rFonts w:ascii="BRH Tamil Tab Extra" w:hAnsi="BRH Tamil Tab Extra" w:cs="Latha"/>
+                <w:b/>
+                <w:bCs/>
+                <w:szCs w:val="28"/>
+                <w:lang w:bidi="ta-IN"/>
+              </w:rPr>
+              <w:t>†</w:t>
+            </w:r>
+            <w:r>
+              <w:rPr>
+                <w:rFonts w:ascii="Latha" w:hAnsi="Latha" w:cs="Latha"/>
+                <w:szCs w:val="28"/>
+                <w:lang w:bidi="ta-IN"/>
+              </w:rPr>
+              <w:t xml:space="preserve"> </w:t>
+            </w:r>
+            <w:r>
+              <w:rPr>
+                <w:rFonts w:ascii="Latha" w:hAnsi="Latha" w:cs="Latha"/>
+                <w:szCs w:val="28"/>
                 <w:highlight w:val="green"/>
-                <w:lang w:val="it-IT"/>
-              </w:rPr>
-              <w:t>UÌ</w:t>
-            </w:r>
-            <w:r>
-              <w:rPr>
-                <w:rFonts w:ascii="BRH Malayalam Extra" w:hAnsi="BRH Malayalam Extra" w:cs="BRH Devanagari Extra"/>
-                <w:color w:val="000000"/>
-                <w:szCs w:val="40"/>
-                <w:lang w:val="it-IT"/>
-              </w:rPr>
-              <w:t>–</w:t>
-            </w:r>
-            <w:r>
-              <w:rPr>
-                <w:rFonts w:ascii="BRH Devanagari Extra" w:hAnsi="BRH Devanagari Extra" w:cs="BRH Devanagari Extra"/>
-                <w:color w:val="000000"/>
-                <w:sz w:val="32"/>
-                <w:szCs w:val="40"/>
-                <w:lang w:val="it-IT"/>
-              </w:rPr>
-              <w:t xml:space="preserve">rÉqÉç | </w:t>
+                <w:cs/>
+                <w:lang w:bidi="ta-IN"/>
+              </w:rPr>
+              <w:t>ர</w:t>
+            </w:r>
+            <w:r>
+              <w:rPr>
+                <w:rFonts w:ascii="BRH Tamil Tab Extra" w:hAnsi="BRH Tamil Tab Extra" w:cs="Latha"/>
+                <w:b/>
+                <w:bCs/>
+                <w:szCs w:val="28"/>
+                <w:highlight w:val="green"/>
+                <w:lang w:bidi="ta-IN"/>
+              </w:rPr>
+              <w:t>…</w:t>
+            </w:r>
+            <w:r>
+              <w:rPr>
+                <w:rFonts w:ascii="Latha" w:hAnsi="Latha" w:cs="Latha"/>
+                <w:szCs w:val="28"/>
+                <w:cs/>
+                <w:lang w:bidi="ta-IN"/>
+              </w:rPr>
+              <w:t xml:space="preserve">யிம் </w:t>
+            </w:r>
+            <w:r>
+              <w:rPr>
+                <w:rFonts w:ascii="Latha" w:hAnsi="Latha" w:cs="Latha"/>
+                <w:szCs w:val="28"/>
+                <w:lang w:bidi="ta-IN"/>
+              </w:rPr>
+              <w:t>|</w:t>
             </w:r>
           </w:p>
         </w:tc>
@@ -12102,6 +12128,7 @@
                 <w:cs/>
                 <w:lang w:bidi="ta-IN"/>
               </w:rPr>
+              <w:lastRenderedPageBreak/>
               <w:t>24</w:t>
             </w:r>
             <w:r>
@@ -12737,7 +12764,6 @@
                 <w:cs/>
                 <w:lang w:bidi="ta-IN"/>
               </w:rPr>
-              <w:lastRenderedPageBreak/>
               <w:t>25</w:t>
             </w:r>
             <w:r>
@@ -14350,6 +14376,7 @@
                 <w:cs/>
                 <w:lang w:bidi="ta-IN"/>
               </w:rPr>
+              <w:lastRenderedPageBreak/>
               <w:t>24</w:t>
             </w:r>
             <w:r>
@@ -14941,7 +14968,6 @@
                 <w:cs/>
                 <w:lang w:bidi="ta-IN"/>
               </w:rPr>
-              <w:lastRenderedPageBreak/>
               <w:t>25</w:t>
             </w:r>
             <w:r>
@@ -17757,7 +17783,17 @@
                 <w:cs/>
                 <w:lang w:bidi="ta-IN"/>
               </w:rPr>
-              <w:t>த்ரோ அ</w:t>
+              <w:t xml:space="preserve">த்ரோ </w:t>
+            </w:r>
+            <w:r>
+              <w:rPr>
+                <w:rFonts w:ascii="Latha" w:hAnsi="Latha" w:cs="Latha"/>
+                <w:szCs w:val="28"/>
+                <w:cs/>
+                <w:lang w:bidi="ta-IN"/>
+              </w:rPr>
+              <w:lastRenderedPageBreak/>
+              <w:t>அ</w:t>
             </w:r>
             <w:r>
               <w:rPr>
@@ -18164,7 +18200,6 @@
                 <w:cs/>
                 <w:lang w:bidi="ta-IN"/>
               </w:rPr>
-              <w:lastRenderedPageBreak/>
               <w:t>அ</w:t>
             </w:r>
             <w:r>
@@ -19324,7 +19359,17 @@
                 <w:cs/>
                 <w:lang w:bidi="ta-IN"/>
               </w:rPr>
-              <w:t>த்ரோ அ</w:t>
+              <w:t xml:space="preserve">த்ரோ </w:t>
+            </w:r>
+            <w:r>
+              <w:rPr>
+                <w:rFonts w:ascii="Latha" w:hAnsi="Latha" w:cs="Latha"/>
+                <w:szCs w:val="28"/>
+                <w:cs/>
+                <w:lang w:bidi="ta-IN"/>
+              </w:rPr>
+              <w:lastRenderedPageBreak/>
+              <w:t>அ</w:t>
             </w:r>
             <w:r>
               <w:rPr>
@@ -19727,7 +19772,6 @@
                 <w:cs/>
                 <w:lang w:bidi="ta-IN"/>
               </w:rPr>
-              <w:lastRenderedPageBreak/>
               <w:t>அ</w:t>
             </w:r>
             <w:r>
@@ -21817,6 +21861,7 @@
                 <w:cs/>
                 <w:lang w:bidi="ta-IN"/>
               </w:rPr>
+              <w:lastRenderedPageBreak/>
               <w:t>ஶுக்</w:t>
             </w:r>
             <w:r>
@@ -22335,6 +22380,7 @@
                 <w:cs/>
                 <w:lang w:bidi="ta-IN"/>
               </w:rPr>
+              <w:lastRenderedPageBreak/>
               <w:t>1</w:t>
             </w:r>
             <w:r>
@@ -23764,6 +23810,7 @@
                 <w:cs/>
                 <w:lang w:bidi="ta-IN"/>
               </w:rPr>
+              <w:lastRenderedPageBreak/>
               <w:t>22</w:t>
             </w:r>
             <w:r>
@@ -27673,6 +27720,7 @@
                 <w:cs/>
                 <w:lang w:bidi="ta-IN"/>
               </w:rPr>
+              <w:lastRenderedPageBreak/>
               <w:t>ஹ</w:t>
             </w:r>
             <w:r>
@@ -28440,7 +28488,6 @@
                 <w:cs/>
                 <w:lang w:bidi="ta-IN"/>
               </w:rPr>
-              <w:lastRenderedPageBreak/>
               <w:t>1</w:t>
             </w:r>
             <w:r>
@@ -29769,6 +29816,7 @@
                 <w:cs/>
                 <w:lang w:bidi="ta-IN"/>
               </w:rPr>
+              <w:lastRenderedPageBreak/>
               <w:t>ஹ</w:t>
             </w:r>
             <w:r>
@@ -30518,7 +30566,6 @@
                 <w:cs/>
                 <w:lang w:bidi="ta-IN"/>
               </w:rPr>
-              <w:lastRenderedPageBreak/>
               <w:t>1</w:t>
             </w:r>
             <w:r>
@@ -32171,6 +32218,7 @@
                 <w:cs/>
                 <w:lang w:bidi="ta-IN"/>
               </w:rPr>
+              <w:lastRenderedPageBreak/>
               <w:t>5</w:t>
             </w:r>
             <w:r>
@@ -33329,6 +33377,7 @@
                 <w:cs/>
                 <w:lang w:bidi="ta-IN"/>
               </w:rPr>
+              <w:lastRenderedPageBreak/>
               <w:t>5</w:t>
             </w:r>
             <w:r>
@@ -33912,6 +33961,7 @@
                 <w:cs/>
                 <w:lang w:bidi="ta-IN"/>
               </w:rPr>
+              <w:lastRenderedPageBreak/>
               <w:t>5</w:t>
             </w:r>
             <w:r>
@@ -36661,6 +36711,7 @@
                 <w:cs/>
                 <w:lang w:bidi="ta-IN"/>
               </w:rPr>
+              <w:lastRenderedPageBreak/>
               <w:t>த்வா மு</w:t>
             </w:r>
             <w:r>
@@ -37834,7 +37885,6 @@
                 <w:cs/>
                 <w:lang w:bidi="ta-IN"/>
               </w:rPr>
-              <w:lastRenderedPageBreak/>
               <w:t>பாவ</w:t>
             </w:r>
             <w:r>
@@ -38263,6 +38313,7 @@
                 <w:cs/>
                 <w:lang w:bidi="ta-IN"/>
               </w:rPr>
+              <w:lastRenderedPageBreak/>
               <w:t>த்வா மு</w:t>
             </w:r>
             <w:r>
@@ -39530,17 +39581,7 @@
                 <w:cs/>
                 <w:lang w:bidi="ta-IN"/>
               </w:rPr>
-              <w:t xml:space="preserve">ரோஹந்து </w:t>
-            </w:r>
-            <w:r>
-              <w:rPr>
-                <w:rFonts w:ascii="Latha" w:hAnsi="Latha" w:cs="Latha"/>
-                <w:szCs w:val="28"/>
-                <w:cs/>
-                <w:lang w:bidi="ta-IN"/>
-              </w:rPr>
-              <w:lastRenderedPageBreak/>
-              <w:t>ஶ்</w:t>
+              <w:t>ரோஹந்து ஶ்</w:t>
             </w:r>
             <w:r>
               <w:rPr>
@@ -41055,6 +41096,7 @@
                 <w:cs/>
                 <w:lang w:bidi="ta-IN"/>
               </w:rPr>
+              <w:lastRenderedPageBreak/>
               <w:t>1</w:t>
             </w:r>
             <w:r>
@@ -42085,16 +42127,68 @@
                 <w:highlight w:val="green"/>
                 <w:lang w:bidi="ta-IN"/>
               </w:rPr>
-              <w:t>is udAttam</w:t>
-            </w:r>
+              <w:t xml:space="preserve">is </w:t>
+            </w:r>
+            <w:proofErr w:type="spellStart"/>
             <w:r>
               <w:rPr>
                 <w:rFonts w:cs="Arial"/>
                 <w:sz w:val="28"/>
                 <w:szCs w:val="28"/>
-                <w:lang w:bidi="ta-IN"/>
-              </w:rPr>
-              <w:t xml:space="preserve"> should not acquire anudAttam should be udAttam only</w:t>
+                <w:highlight w:val="green"/>
+                <w:lang w:bidi="ta-IN"/>
+              </w:rPr>
+              <w:t>udAttam</w:t>
+            </w:r>
+            <w:proofErr w:type="spellEnd"/>
+            <w:r>
+              <w:rPr>
+                <w:rFonts w:cs="Arial"/>
+                <w:sz w:val="28"/>
+                <w:szCs w:val="28"/>
+                <w:lang w:bidi="ta-IN"/>
+              </w:rPr>
+              <w:t xml:space="preserve"> should not acquire </w:t>
+            </w:r>
+            <w:proofErr w:type="spellStart"/>
+            <w:r>
+              <w:rPr>
+                <w:rFonts w:cs="Arial"/>
+                <w:sz w:val="28"/>
+                <w:szCs w:val="28"/>
+                <w:lang w:bidi="ta-IN"/>
+              </w:rPr>
+              <w:t>anudAttam</w:t>
+            </w:r>
+            <w:proofErr w:type="spellEnd"/>
+            <w:r>
+              <w:rPr>
+                <w:rFonts w:cs="Arial"/>
+                <w:sz w:val="28"/>
+                <w:szCs w:val="28"/>
+                <w:lang w:bidi="ta-IN"/>
+              </w:rPr>
+              <w:t xml:space="preserve"> should be </w:t>
+            </w:r>
+            <w:proofErr w:type="spellStart"/>
+            <w:r>
+              <w:rPr>
+                <w:rFonts w:cs="Arial"/>
+                <w:sz w:val="28"/>
+                <w:szCs w:val="28"/>
+                <w:lang w:bidi="ta-IN"/>
+              </w:rPr>
+              <w:t>udAttam</w:t>
+            </w:r>
+            <w:proofErr w:type="spellEnd"/>
+            <w:r>
+              <w:rPr>
+                <w:rFonts w:cs="Arial"/>
+                <w:sz w:val="28"/>
+                <w:szCs w:val="28"/>
+                <w:lang w:bidi="ta-IN"/>
+              </w:rPr>
+              <w:t xml:space="preserve"> only</w:t>
             </w:r>
           </w:p>
         </w:tc>
@@ -43080,7 +43174,6 @@
                 <w:cs/>
                 <w:lang w:bidi="ta-IN"/>
               </w:rPr>
-              <w:lastRenderedPageBreak/>
               <w:t>36</w:t>
             </w:r>
             <w:r>
@@ -43997,6 +44090,7 @@
                 <w:cs/>
                 <w:lang w:bidi="ta-IN"/>
               </w:rPr>
+              <w:lastRenderedPageBreak/>
               <w:t>அத்</w:t>
             </w:r>
             <w:r>
@@ -45011,7 +45105,6 @@
                 <w:cs/>
                 <w:lang w:bidi="ta-IN"/>
               </w:rPr>
-              <w:lastRenderedPageBreak/>
               <w:t>அ</w:t>
             </w:r>
             <w:r>
@@ -45942,6 +46035,7 @@
                 <w:szCs w:val="28"/>
                 <w:lang w:bidi="ta-IN"/>
               </w:rPr>
+              <w:lastRenderedPageBreak/>
               <w:t>Å</w:t>
             </w:r>
             <w:r>
@@ -47773,6 +47867,7 @@
           <w:szCs w:val="32"/>
           <w:u w:val="single"/>
         </w:rPr>
+        <w:lastRenderedPageBreak/>
         <w:t>=============</w:t>
       </w:r>
     </w:p>
@@ -48668,7 +48763,7 @@
   <w:style w:type="paragraph" w:default="1" w:styleId="Normal">
     <w:name w:val="Normal"/>
     <w:qFormat/>
-    <w:rsid w:val="00076C05"/>
+    <w:rsid w:val="00E9604C"/>
     <w:pPr>
       <w:spacing w:before="120" w:line="276" w:lineRule="auto"/>
     </w:pPr>

</xml_diff>